<commit_message>
add mwe for boos.xml
</commit_message>
<xml_diff>
--- a/topic13-wip/proj spec/Functional Programming Assignment.docx
+++ b/topic13-wip/proj spec/Functional Programming Assignment.docx
@@ -879,8 +879,8 @@
         <w:rPr>
           <w:noProof/>
         </w:rPr>
-        <w:pict w14:anchorId="2394AFB0">
-          <v:rect id="_x0000_i1040" alt="" style="width:450.85pt;height:.05pt;mso-width-percent:0;mso-height-percent:0;mso-width-percent:0;mso-height-percent:0" o:hrpct="999" o:hralign="center" o:hrstd="t" o:hr="t" fillcolor="#a0a0a0" stroked="f"/>
+        <w:pict w14:anchorId="63EE423F">
+          <v:rect id="_x0000_i1039" alt="" style="width:450.85pt;height:.05pt;mso-width-percent:0;mso-height-percent:0;mso-width-percent:0;mso-height-percent:0" o:hrpct="999" o:hralign="center" o:hrstd="t" o:hr="t" fillcolor="#a0a0a0" stroked="f"/>
         </w:pict>
       </w:r>
     </w:p>
@@ -1030,8 +1030,8 @@
         <w:rPr>
           <w:noProof/>
         </w:rPr>
-        <w:pict w14:anchorId="4F29E3D9">
-          <v:rect id="_x0000_i1039" alt="" style="width:450.85pt;height:.05pt;mso-width-percent:0;mso-height-percent:0;mso-width-percent:0;mso-height-percent:0" o:hrpct="999" o:hralign="center" o:hrstd="t" o:hr="t" fillcolor="#a0a0a0" stroked="f"/>
+        <w:pict w14:anchorId="13A7A161">
+          <v:rect id="_x0000_i1038" alt="" style="width:450.85pt;height:.05pt;mso-width-percent:0;mso-height-percent:0;mso-width-percent:0;mso-height-percent:0" o:hrpct="999" o:hralign="center" o:hrstd="t" o:hr="t" fillcolor="#a0a0a0" stroked="f"/>
         </w:pict>
       </w:r>
     </w:p>
@@ -1172,8 +1172,8 @@
         <w:rPr>
           <w:noProof/>
         </w:rPr>
-        <w:pict w14:anchorId="368EF963">
-          <v:rect id="_x0000_i1038" style="width:0;height:1.5pt" o:hralign="center" o:hrstd="t" o:hr="t" fillcolor="#a0a0a0" stroked="f"/>
+        <w:pict w14:anchorId="38912A95">
+          <v:rect id="_x0000_i1037" style="width:0;height:1.5pt" o:hralign="center" o:hrstd="t" o:hr="t" fillcolor="#a0a0a0" stroked="f"/>
         </w:pict>
       </w:r>
     </w:p>
@@ -2080,8 +2080,8 @@
         <w:rPr>
           <w:noProof/>
         </w:rPr>
-        <w:pict w14:anchorId="3DE01EC5">
-          <v:rect id="_x0000_i1037" alt="" style="width:450.85pt;height:.05pt;mso-width-percent:0;mso-height-percent:0;mso-width-percent:0;mso-height-percent:0" o:hrpct="999" o:hralign="center" o:hrstd="t" o:hr="t" fillcolor="#a0a0a0" stroked="f"/>
+        <w:pict w14:anchorId="68861C72">
+          <v:rect id="_x0000_i1036" alt="" style="width:450.85pt;height:.05pt;mso-width-percent:0;mso-height-percent:0;mso-width-percent:0;mso-height-percent:0" o:hrpct="999" o:hralign="center" o:hrstd="t" o:hr="t" fillcolor="#a0a0a0" stroked="f"/>
         </w:pict>
       </w:r>
     </w:p>
@@ -2174,8 +2174,8 @@
         <w:rPr>
           <w:noProof/>
         </w:rPr>
-        <w:pict w14:anchorId="333E7A0A">
-          <v:rect id="_x0000_i1036" alt="" style="width:450.85pt;height:.05pt;mso-width-percent:0;mso-height-percent:0;mso-width-percent:0;mso-height-percent:0" o:hrpct="999" o:hralign="center" o:hrstd="t" o:hr="t" fillcolor="#a0a0a0" stroked="f"/>
+        <w:pict w14:anchorId="47A20E23">
+          <v:rect id="_x0000_i1035" alt="" style="width:450.85pt;height:.05pt;mso-width-percent:0;mso-height-percent:0;mso-width-percent:0;mso-height-percent:0" o:hrpct="999" o:hralign="center" o:hrstd="t" o:hr="t" fillcolor="#a0a0a0" stroked="f"/>
         </w:pict>
       </w:r>
     </w:p>
@@ -2256,8 +2256,8 @@
         <w:rPr>
           <w:noProof/>
         </w:rPr>
-        <w:pict w14:anchorId="52F52E05">
-          <v:rect id="_x0000_i1035" alt="" style="width:450.85pt;height:.05pt;mso-width-percent:0;mso-height-percent:0;mso-width-percent:0;mso-height-percent:0" o:hrpct="999" o:hralign="center" o:hrstd="t" o:hr="t" fillcolor="#a0a0a0" stroked="f"/>
+        <w:pict w14:anchorId="17C985DF">
+          <v:rect id="_x0000_i1034" alt="" style="width:450.85pt;height:.05pt;mso-width-percent:0;mso-height-percent:0;mso-width-percent:0;mso-height-percent:0" o:hrpct="999" o:hralign="center" o:hrstd="t" o:hr="t" fillcolor="#a0a0a0" stroked="f"/>
         </w:pict>
       </w:r>
     </w:p>
@@ -2447,8 +2447,8 @@
         <w:rPr>
           <w:noProof/>
         </w:rPr>
-        <w:pict w14:anchorId="141EC1C5">
-          <v:rect id="_x0000_i1034" alt="" style="width:450.85pt;height:.05pt;mso-width-percent:0;mso-height-percent:0;mso-width-percent:0;mso-height-percent:0" o:hrpct="999" o:hralign="center" o:hrstd="t" o:hr="t" fillcolor="#a0a0a0" stroked="f"/>
+        <w:pict w14:anchorId="76DE5B80">
+          <v:rect id="_x0000_i1033" alt="" style="width:450.85pt;height:.05pt;mso-width-percent:0;mso-height-percent:0;mso-width-percent:0;mso-height-percent:0" o:hrpct="999" o:hralign="center" o:hrstd="t" o:hr="t" fillcolor="#a0a0a0" stroked="f"/>
         </w:pict>
       </w:r>
     </w:p>
@@ -2565,8 +2565,8 @@
         <w:rPr>
           <w:noProof/>
         </w:rPr>
-        <w:pict w14:anchorId="7720C958">
-          <v:rect id="_x0000_i1033" alt="" style="width:450.85pt;height:.05pt;mso-width-percent:0;mso-height-percent:0;mso-width-percent:0;mso-height-percent:0" o:hrpct="999" o:hralign="center" o:hrstd="t" o:hr="t" fillcolor="#a0a0a0" stroked="f"/>
+        <w:pict w14:anchorId="5D11D3C7">
+          <v:rect id="_x0000_i1032" alt="" style="width:450.85pt;height:.05pt;mso-width-percent:0;mso-height-percent:0;mso-width-percent:0;mso-height-percent:0" o:hrpct="999" o:hralign="center" o:hrstd="t" o:hr="t" fillcolor="#a0a0a0" stroked="f"/>
         </w:pict>
       </w:r>
     </w:p>
@@ -2669,8 +2669,8 @@
         <w:rPr>
           <w:noProof/>
         </w:rPr>
-        <w:pict w14:anchorId="5655BEAD">
-          <v:rect id="_x0000_i1032" alt="" style="width:450.85pt;height:.05pt;mso-width-percent:0;mso-height-percent:0;mso-width-percent:0;mso-height-percent:0" o:hrpct="999" o:hralign="center" o:hrstd="t" o:hr="t" fillcolor="#a0a0a0" stroked="f"/>
+        <w:pict w14:anchorId="6CD216AC">
+          <v:rect id="_x0000_i1031" alt="" style="width:450.85pt;height:.05pt;mso-width-percent:0;mso-height-percent:0;mso-width-percent:0;mso-height-percent:0" o:hrpct="999" o:hralign="center" o:hrstd="t" o:hr="t" fillcolor="#a0a0a0" stroked="f"/>
         </w:pict>
       </w:r>
     </w:p>
@@ -2839,8 +2839,8 @@
         <w:rPr>
           <w:noProof/>
         </w:rPr>
-        <w:pict w14:anchorId="4E1EE67C">
-          <v:rect id="_x0000_i1031" alt="" style="width:450.85pt;height:.05pt;mso-width-percent:0;mso-height-percent:0;mso-width-percent:0;mso-height-percent:0" o:hrpct="999" o:hralign="center" o:hrstd="t" o:hr="t" fillcolor="#a0a0a0" stroked="f"/>
+        <w:pict w14:anchorId="6A63AEAA">
+          <v:rect id="_x0000_i1030" alt="" style="width:450.85pt;height:.05pt;mso-width-percent:0;mso-height-percent:0;mso-width-percent:0;mso-height-percent:0" o:hrpct="999" o:hralign="center" o:hrstd="t" o:hr="t" fillcolor="#a0a0a0" stroked="f"/>
         </w:pict>
       </w:r>
     </w:p>
@@ -3121,8 +3121,8 @@
         <w:rPr>
           <w:noProof/>
         </w:rPr>
-        <w:pict w14:anchorId="3ED20483">
-          <v:rect id="_x0000_i1030" alt="" style="width:450.85pt;height:.05pt;mso-width-percent:0;mso-height-percent:0;mso-width-percent:0;mso-height-percent:0" o:hrpct="999" o:hralign="center" o:hrstd="t" o:hr="t" fillcolor="#a0a0a0" stroked="f"/>
+        <w:pict w14:anchorId="25BF5691">
+          <v:rect id="_x0000_i1029" alt="" style="width:450.85pt;height:.05pt;mso-width-percent:0;mso-height-percent:0;mso-width-percent:0;mso-height-percent:0" o:hrpct="999" o:hralign="center" o:hrstd="t" o:hr="t" fillcolor="#a0a0a0" stroked="f"/>
         </w:pict>
       </w:r>
     </w:p>
@@ -3247,8 +3247,8 @@
         <w:rPr>
           <w:noProof/>
         </w:rPr>
-        <w:pict w14:anchorId="6E7E55A1">
-          <v:rect id="_x0000_i1029" alt="" style="width:450.85pt;height:.05pt;mso-width-percent:0;mso-height-percent:0;mso-width-percent:0;mso-height-percent:0" o:hrpct="999" o:hralign="center" o:hrstd="t" o:hr="t" fillcolor="#a0a0a0" stroked="f"/>
+        <w:pict w14:anchorId="0341123E">
+          <v:rect id="_x0000_i1028" alt="" style="width:450.85pt;height:.05pt;mso-width-percent:0;mso-height-percent:0;mso-width-percent:0;mso-height-percent:0" o:hrpct="999" o:hralign="center" o:hrstd="t" o:hr="t" fillcolor="#a0a0a0" stroked="f"/>
         </w:pict>
       </w:r>
     </w:p>
@@ -3386,8 +3386,8 @@
         <w:rPr>
           <w:noProof/>
         </w:rPr>
-        <w:pict w14:anchorId="1483CF99">
-          <v:rect id="_x0000_i1028" alt="" style="width:450.85pt;height:.05pt;mso-width-percent:0;mso-height-percent:0;mso-width-percent:0;mso-height-percent:0" o:hrpct="999" o:hralign="center" o:hrstd="t" o:hr="t" fillcolor="#a0a0a0" stroked="f"/>
+        <w:pict w14:anchorId="414C04AD">
+          <v:rect id="_x0000_i1027" alt="" style="width:450.85pt;height:.05pt;mso-width-percent:0;mso-height-percent:0;mso-width-percent:0;mso-height-percent:0" o:hrpct="999" o:hralign="center" o:hrstd="t" o:hr="t" fillcolor="#a0a0a0" stroked="f"/>
         </w:pict>
       </w:r>
     </w:p>
@@ -3657,8 +3657,8 @@
         <w:rPr>
           <w:noProof/>
         </w:rPr>
-        <w:pict w14:anchorId="1F3C0361">
-          <v:rect id="_x0000_i1027" alt="" style="width:450.85pt;height:.05pt;mso-width-percent:0;mso-height-percent:0;mso-width-percent:0;mso-height-percent:0" o:hrpct="999" o:hralign="center" o:hrstd="t" o:hr="t" fillcolor="#a0a0a0" stroked="f"/>
+        <w:pict w14:anchorId="34B37201">
+          <v:rect id="_x0000_i1026" style="width:0;height:1.5pt" o:hralign="center" o:hrstd="t" o:hr="t" fillcolor="#a0a0a0" stroked="f"/>
         </w:pict>
       </w:r>
     </w:p>
@@ -3732,6 +3732,119 @@
       </w:pPr>
       <w:r>
         <w:t>In other words, do not try to implement all of Moodle before lunch.</w:t>
+      </w:r>
+    </w:p>
+    <w:p/>
+    <w:p>
+      <w:pPr>
+        <w:pStyle w:val="Heading1"/>
+      </w:pPr>
+      <w:r>
+        <w:t>13. Submission Guidance</w:t>
+      </w:r>
+    </w:p>
+    <w:p>
+      <w:pPr>
+        <w:pStyle w:val="NormalWeb"/>
+      </w:pPr>
+      <w:r>
+        <w:t>Your submission should:</w:t>
+      </w:r>
+    </w:p>
+    <w:p>
+      <w:pPr>
+        <w:pStyle w:val="NormalWeb"/>
+        <w:numPr>
+          <w:ilvl w:val="0"/>
+          <w:numId w:val="48"/>
+        </w:numPr>
+      </w:pPr>
+      <w:r>
+        <w:t>compile successfully</w:t>
+      </w:r>
+    </w:p>
+    <w:p>
+      <w:pPr>
+        <w:pStyle w:val="NormalWeb"/>
+        <w:numPr>
+          <w:ilvl w:val="0"/>
+          <w:numId w:val="48"/>
+        </w:numPr>
+      </w:pPr>
+      <w:r>
+        <w:t>include all required source files</w:t>
+      </w:r>
+    </w:p>
+    <w:p>
+      <w:pPr>
+        <w:pStyle w:val="NormalWeb"/>
+        <w:numPr>
+          <w:ilvl w:val="0"/>
+          <w:numId w:val="48"/>
+        </w:numPr>
+      </w:pPr>
+      <w:r>
+        <w:t xml:space="preserve">include a README </w:t>
+      </w:r>
+    </w:p>
+    <w:p>
+      <w:pPr>
+        <w:pStyle w:val="NormalWeb"/>
+        <w:numPr>
+          <w:ilvl w:val="0"/>
+          <w:numId w:val="49"/>
+        </w:numPr>
+      </w:pPr>
+      <w:r>
+        <w:t>nclude a README with build and run instructions</w:t>
+      </w:r>
+    </w:p>
+    <w:p>
+      <w:pPr>
+        <w:pStyle w:val="NormalWeb"/>
+        <w:numPr>
+          <w:ilvl w:val="0"/>
+          <w:numId w:val="49"/>
+        </w:numPr>
+      </w:pPr>
+      <w:r>
+        <w:t>include sample outputs</w:t>
+      </w:r>
+    </w:p>
+    <w:p>
+      <w:pPr>
+        <w:pStyle w:val="NormalWeb"/>
+        <w:numPr>
+          <w:ilvl w:val="0"/>
+          <w:numId w:val="49"/>
+        </w:numPr>
+      </w:pPr>
+      <w:r>
+        <w:t>include a brief design note</w:t>
+      </w:r>
+    </w:p>
+    <w:p>
+      <w:pPr>
+        <w:pStyle w:val="NormalWeb"/>
+        <w:numPr>
+          <w:ilvl w:val="0"/>
+          <w:numId w:val="49"/>
+        </w:numPr>
+      </w:pPr>
+      <w:r>
+        <w:t>make clear where invariants are enforced</w:t>
+      </w:r>
+    </w:p>
+    <w:p>
+      <w:pPr>
+        <w:pStyle w:val="NormalWeb"/>
+        <w:numPr>
+          <w:ilvl w:val="0"/>
+          <w:numId w:val="49"/>
+        </w:numPr>
+      </w:pPr>
+      <w:r>
+        <w:t>make clear where QuickCheck is used</w:t>
       </w:r>
     </w:p>
     <w:p>
@@ -3739,129 +3852,7 @@
         <w:rPr>
           <w:noProof/>
         </w:rPr>
-        <w:pict w14:anchorId="0E6D6034">
-          <v:rect id="_x0000_i1026" alt="" style="width:450.85pt;height:.05pt;mso-width-percent:0;mso-height-percent:0;mso-width-percent:0;mso-height-percent:0" o:hrpct="999" o:hralign="center" o:hrstd="t" o:hr="t" fillcolor="#a0a0a0" stroked="f"/>
-        </w:pict>
-      </w:r>
-    </w:p>
-    <w:p>
-      <w:pPr>
-        <w:pStyle w:val="Heading1"/>
-      </w:pPr>
-      <w:r>
-        <w:t>13. Submission Guidance</w:t>
-      </w:r>
-    </w:p>
-    <w:p>
-      <w:pPr>
-        <w:pStyle w:val="NormalWeb"/>
-      </w:pPr>
-      <w:r>
-        <w:t>Your submission should:</w:t>
-      </w:r>
-    </w:p>
-    <w:p>
-      <w:pPr>
-        <w:pStyle w:val="NormalWeb"/>
-        <w:numPr>
-          <w:ilvl w:val="0"/>
-          <w:numId w:val="48"/>
-        </w:numPr>
-      </w:pPr>
-      <w:r>
-        <w:t>compile successfully</w:t>
-      </w:r>
-    </w:p>
-    <w:p>
-      <w:pPr>
-        <w:pStyle w:val="NormalWeb"/>
-        <w:numPr>
-          <w:ilvl w:val="0"/>
-          <w:numId w:val="48"/>
-        </w:numPr>
-      </w:pPr>
-      <w:r>
-        <w:t>include all required source files</w:t>
-      </w:r>
-    </w:p>
-    <w:p>
-      <w:pPr>
-        <w:pStyle w:val="NormalWeb"/>
-        <w:numPr>
-          <w:ilvl w:val="0"/>
-          <w:numId w:val="48"/>
-        </w:numPr>
-      </w:pPr>
-      <w:r>
-        <w:t xml:space="preserve">include a README </w:t>
-      </w:r>
-    </w:p>
-    <w:p>
-      <w:pPr>
-        <w:pStyle w:val="NormalWeb"/>
-        <w:numPr>
-          <w:ilvl w:val="0"/>
-          <w:numId w:val="49"/>
-        </w:numPr>
-      </w:pPr>
-      <w:r>
-        <w:t>nclude a README with build and run instructions</w:t>
-      </w:r>
-    </w:p>
-    <w:p>
-      <w:pPr>
-        <w:pStyle w:val="NormalWeb"/>
-        <w:numPr>
-          <w:ilvl w:val="0"/>
-          <w:numId w:val="49"/>
-        </w:numPr>
-      </w:pPr>
-      <w:r>
-        <w:t>include sample outputs</w:t>
-      </w:r>
-    </w:p>
-    <w:p>
-      <w:pPr>
-        <w:pStyle w:val="NormalWeb"/>
-        <w:numPr>
-          <w:ilvl w:val="0"/>
-          <w:numId w:val="49"/>
-        </w:numPr>
-      </w:pPr>
-      <w:r>
-        <w:t>include a brief design note</w:t>
-      </w:r>
-    </w:p>
-    <w:p>
-      <w:pPr>
-        <w:pStyle w:val="NormalWeb"/>
-        <w:numPr>
-          <w:ilvl w:val="0"/>
-          <w:numId w:val="49"/>
-        </w:numPr>
-      </w:pPr>
-      <w:r>
-        <w:t>make clear where invariants are enforced</w:t>
-      </w:r>
-    </w:p>
-    <w:p>
-      <w:pPr>
-        <w:pStyle w:val="NormalWeb"/>
-        <w:numPr>
-          <w:ilvl w:val="0"/>
-          <w:numId w:val="49"/>
-        </w:numPr>
-      </w:pPr>
-      <w:r>
-        <w:t>make clear where QuickCheck is used</w:t>
-      </w:r>
-    </w:p>
-    <w:p>
-      <w:r>
-        <w:rPr>
-          <w:noProof/>
-        </w:rPr>
-        <w:pict w14:anchorId="0B8443C0">
+        <w:pict w14:anchorId="3EED00B3">
           <v:rect id="_x0000_i1025" style="width:0;height:1.5pt" o:hralign="center" o:hrstd="t" o:hr="t" fillcolor="#a0a0a0" stroked="f"/>
         </w:pict>
       </w:r>

</xml_diff>